<commit_message>
docs(ontologia): actualizar bitácora y agregar notebook de consultas SPARQL
</commit_message>
<xml_diff>
--- a/workshops/02-ontologia-ciclo-conflicto/BITACORA_TALLER_2_ONTOLOGIA_Y_WORDNET.docx
+++ b/workshops/02-ontologia-ciclo-conflicto/BITACORA_TALLER_2_ONTOLOGIA_Y_WORDNET.docx
@@ -125,7 +125,7 @@
           <w:b w:val="0"/>
           <w:sz w:val="22"/>
         </w:rPr>
-        <w:t>El resultado se exportó como ontología OWL. La versión base contiene 3.116 clases y organiza los cinco grupos desde sus conceptos raíz hacia categorías y términos más concretos. Por ejemplo, Armas contiene instrumentos, armas blancas y armas de fuego; Hechos victimizantes incluye ramificaciones como amenaza al derecho a la vida, desaparición forzada, homicidio, reclutamiento y violencia sexual; y Estructuras armadas distingue estructuras legales e ilegales. La profundidad se mantuvo cuando el Excel aportaba una relación jerárquica explícita, evitando inventar subclases que no estuvieran sustentadas por el tesauro.</w:t>
+        <w:t>El resultado se exportó como ontología OWL. La versión base contiene 2.968 clases y organiza los cinco grupos desde sus conceptos raíz hacia categorías y términos más concretos. La reducción frente a la versión anterior (3.116 clases) se debe a la limpieza de clases-sigla duplicadas, que se fusionaron dentro del label de la clase correspondiente (por ejemplo, ELN dejó de ser una clase separada y pasó a integrarse en el label de Ejercito_de_Liberacion_Nacional). Por ejemplo, Armas contiene instrumentos, armas blancas y armas de fuego; Hechos victimizantes incluye ramificaciones como amenaza al derecho a la vida, desaparición forzada, homicidio, reclutamiento y violencia sexual; y Estructuras armadas distingue estructuras legales e ilegales. La profundidad se mantuvo cuando el Excel aportaba una relación jerárquica explícita, evitando inventar subclases que no estuvieran sustentadas por el tesauro.</w:t>
       </w:r>
     </w:p>
     <w:p>
@@ -153,7 +153,17 @@
           <w:b w:val="0"/>
           <w:sz w:val="22"/>
         </w:rPr>
-        <w:t>También se definieron cuatro object properties. usaArma conecta una Estructura armada con Arma; cometeHecho conecta una Estructura armada con Hecho victimizante; afectaA conecta un Hecho victimizante con Profesión u oficio; y sedesmovilizaEn conecta una Estructura armada con Partidos y movimientos políticos. Declarar dominio y rango no fue un detalle decorativo: restringe las combinaciones que la ontología puede expresar y permite detectar modelados incoherentes antes de poblar datos.</w:t>
+        <w:t>También se definieron cuatro object properties. usaArma conecta una Estructura armada con Arma; cometeHecho conecta una Estructura armada con Hecho victimizante; tieneMiembroConOficio relaciona una estructura armada con el oficio que ejercen sus integrantes (ej. Guerrillero, Paramilitar, Sicario); y sedesmovilizaEn conecta una Estructura armada con Partidos y movimientos políticos. Declarar dominio y rango no fue un detalle decorativo: restringe las combinaciones que la ontología puede expresar y permite detectar modelados incoherentes antes de poblar datos.</w:t>
+      </w:r>
+    </w:p>
+    <w:p>
+      <w:r>
+        <w:rPr>
+          <w:rFonts w:ascii="Arial" w:hAnsi="Arial"/>
+          <w:b w:val="0"/>
+          <w:sz w:val="22"/>
+        </w:rPr>
+        <w:t>Adicionalmente, sedesmovilizaEn incluye en su rdfs:comment una pregunta abierta al profesor sobre si una relación (object property) debe cumplirse de forma obligatoria para todas las instancias de la clase dominio, o si es válido modelar excepciones históricas documentadas que solo aplican a un subconjunto de instancias.</w:t>
       </w:r>
     </w:p>
     <w:p>
@@ -223,7 +233,7 @@
           <w:b w:val="0"/>
           <w:sz w:val="22"/>
         </w:rPr>
-        <w:t>Las siguientes 15 consultas constituyen el conjunto documentado para ejecutar en Protégé o en un endpoint compatible. Se usan los prefijos del archivo OWL; las consultas de relación devolverán resultados cuando los individuos estén poblados.</w:t>
+        <w:t>Las siguientes 13 consultas constituyen el conjunto documentado para ejecutar en Protégé o en un endpoint compatible. Se usan los prefijos del archivo OWL; las consultas de relación devolverán resultados cuando los individuos estén poblados. El conjunto quedó temporalmente en 13 consultas tras eliminar las dos que dependían de la propiedad afectaA (ya no existe en el modelo); se completarán 2 consultas adicionales para llegar a las 15 requeridas por el taller una vez estén rediseñadas.</w:t>
       </w:r>
     </w:p>
     <w:p>
@@ -462,52 +472,7 @@
           <w:b/>
           <w:sz w:val="22"/>
         </w:rPr>
-        <w:t>Consulta 6. Hechos victimizantes</w:t>
-      </w:r>
-    </w:p>
-    <w:p>
-      <w:pPr>
-        <w:spacing w:after="160" w:line="276" w:lineRule="auto"/>
-        <w:jc w:val="both"/>
-      </w:pPr>
-      <w:r>
-        <w:rPr>
-          <w:rFonts w:ascii="Arial" w:hAnsi="Arial"/>
-          <w:b w:val="0"/>
-          <w:sz w:val="22"/>
-        </w:rPr>
-        <w:t>Busca hechos y oficios afectados, usando la relación afectaA definida en el modelo.</w:t>
-      </w:r>
-    </w:p>
-    <w:p>
-      <w:pPr>
-        <w:spacing w:after="160"/>
-        <w:ind w:left="360"/>
-      </w:pPr>
-      <w:r>
-        <w:rPr>
-          <w:rFonts w:ascii="Courier New" w:hAnsi="Courier New"/>
-          <w:sz w:val="17"/>
-        </w:rPr>
-        <w:t>PREFIX : &lt;http://www.semanticweb.org/tesauro-cev-ciclo-conflicto#&gt;</w:t>
-        <w:br/>
-        <w:t>PREFIX rdfs: &lt;http://www.w3.org/2000/01/rdf-schema#&gt;</w:t>
-        <w:br/>
-        <w:t>SELECT ?hecho ?oficio WHERE { ?hecho :afectaA ?oficio . } ORDER BY ?hecho</w:t>
-      </w:r>
-    </w:p>
-    <w:p>
-      <w:pPr>
-        <w:spacing w:after="160" w:line="276" w:lineRule="auto"/>
-        <w:jc w:val="both"/>
-      </w:pPr>
-      <w:r>
-        <w:rPr>
-          <w:rFonts w:ascii="Arial" w:hAnsi="Arial"/>
-          <w:b/>
-          <w:sz w:val="22"/>
-        </w:rPr>
-        <w:t>Consulta 7. Estructuras armadas</w:t>
+        <w:t>Consulta 6. Estructuras armadas</w:t>
       </w:r>
     </w:p>
     <w:p>
@@ -552,7 +517,7 @@
           <w:b/>
           <w:sz w:val="22"/>
         </w:rPr>
-        <w:t>Consulta 8. Estructuras armadas</w:t>
+        <w:t>Consulta 7. Estructuras armadas</w:t>
       </w:r>
     </w:p>
     <w:p>
@@ -597,7 +562,7 @@
           <w:b/>
           <w:sz w:val="22"/>
         </w:rPr>
-        <w:t>Consulta 9. Estructuras armadas</w:t>
+        <w:t>Consulta 8. Estructuras armadas</w:t>
       </w:r>
     </w:p>
     <w:p>
@@ -642,7 +607,7 @@
           <w:b/>
           <w:sz w:val="22"/>
         </w:rPr>
-        <w:t>Consulta 10. Profesiones y oficios</w:t>
+        <w:t>Consulta 9. Profesiones y oficios</w:t>
       </w:r>
     </w:p>
     <w:p>
@@ -687,7 +652,7 @@
           <w:b/>
           <w:sz w:val="22"/>
         </w:rPr>
-        <w:t>Consulta 11. Profesiones y oficios</w:t>
+        <w:t>Consulta 10. Profesiones y oficios</w:t>
       </w:r>
     </w:p>
     <w:p>
@@ -732,52 +697,7 @@
           <w:b/>
           <w:sz w:val="22"/>
         </w:rPr>
-        <w:t>Consulta 12. Profesiones y oficios</w:t>
-      </w:r>
-    </w:p>
-    <w:p>
-      <w:pPr>
-        <w:spacing w:after="160" w:line="276" w:lineRule="auto"/>
-        <w:jc w:val="both"/>
-      </w:pPr>
-      <w:r>
-        <w:rPr>
-          <w:rFonts w:ascii="Arial" w:hAnsi="Arial"/>
-          <w:b w:val="0"/>
-          <w:sz w:val="22"/>
-        </w:rPr>
-        <w:t>Recupera los oficios o profesiones asociados a un hecho victimizante específico.</w:t>
-      </w:r>
-    </w:p>
-    <w:p>
-      <w:pPr>
-        <w:spacing w:after="160"/>
-        <w:ind w:left="360"/>
-      </w:pPr>
-      <w:r>
-        <w:rPr>
-          <w:rFonts w:ascii="Courier New" w:hAnsi="Courier New"/>
-          <w:sz w:val="17"/>
-        </w:rPr>
-        <w:t>PREFIX : &lt;http://www.semanticweb.org/tesauro-cev-ciclo-conflicto#&gt;</w:t>
-        <w:br/>
-        <w:t>PREFIX rdfs: &lt;http://www.w3.org/2000/01/rdf-schema#&gt;</w:t>
-        <w:br/>
-        <w:t>SELECT ?hecho ?oficio WHERE { ?hecho :afectaA ?oficio . } ORDER BY ?oficio</w:t>
-      </w:r>
-    </w:p>
-    <w:p>
-      <w:pPr>
-        <w:spacing w:after="160" w:line="276" w:lineRule="auto"/>
-        <w:jc w:val="both"/>
-      </w:pPr>
-      <w:r>
-        <w:rPr>
-          <w:rFonts w:ascii="Arial" w:hAnsi="Arial"/>
-          <w:b/>
-          <w:sz w:val="22"/>
-        </w:rPr>
-        <w:t>Consulta 13. Partidos y movimientos políticos</w:t>
+        <w:t>Consulta 11. Partidos y movimientos políticos</w:t>
       </w:r>
     </w:p>
     <w:p>
@@ -822,7 +742,7 @@
           <w:b/>
           <w:sz w:val="22"/>
         </w:rPr>
-        <w:t>Consulta 14. Partidos y movimientos políticos</w:t>
+        <w:t>Consulta 12. Partidos y movimientos políticos</w:t>
       </w:r>
     </w:p>
     <w:p>
@@ -867,7 +787,7 @@
           <w:b/>
           <w:sz w:val="22"/>
         </w:rPr>
-        <w:t>Consulta 15. Partidos y movimientos políticos</w:t>
+        <w:t>Consulta 13. Partidos y movimientos políticos</w:t>
       </w:r>
     </w:p>
     <w:p>

</xml_diff>